<commit_message>
James: full meaning audit 2026-09-23 — 7 text fixes (all KO), gates 1-8 PASS, 0 split candidates
</commit_message>
<xml_diff>
--- a/gdocs_build/James.docx
+++ b/gdocs_build/James.docx
@@ -770,7 +770,7 @@
               <w:rPr>
                 <w:sz w:val="18"/>
               </w:rPr>
-              <w:t>이걸 모든 사거리에 붙여둬, 친구들아. 귀는 먼저, 입은 나중에, 화는 맨 뒤에서 질질 끌려오게 해. 사람의 분노로는 하나님의 의가 자라지 않아. 그러니까 썩은 습관이랑 암 같은 악은 쓰레기통에 버려. 단순한 겸손함으로, 정원사 되시는 하나님이 말씀으로 너희를 가꿔서 너희 인생을 구원의 정원으로 만들게 해드려.</w:t>
+              <w:t>이걸 모든 사거리에 붙여둬, 친구들아. 귀는 먼저, 입은 나중에, 화는 맨 뒤에서 질질 끌려오게 해. 사람의 분노로는 하나님의 의가 자라지 않아. 그러니까 썩은 덕이랑 암 같은 악은 쓰레기통에 버려. 단순한 겸손함으로, 정원사 되시는 하나님이 말씀으로 너희를 가꿔서 너희 인생을 구원의 정원으로 만들게 해드려.</w:t>
             </w:r>
           </w:p>
         </w:tc>
@@ -1184,7 +1184,7 @@
               <w:rPr>
                 <w:sz w:val="18"/>
               </w:rPr>
-              <w:t>내 사랑하는 친구들아, 우리의 영광스럽고 예수님에게서 시작된 믿음을 세상의 눈치에 따라 살지 마. 이런 상황을 상상해봐. 어떤 사람이 비싼 정장을 입고 너희 교회에 들어오고, 바로 뒤에 누더기를 입은 노숙자가 들어와. 정장 입은 사람한테는 “여기 앉으세요, 선생님 — 최고의 자리입니다!”라고 하면서, 노숙자는 무시하거나 “뒷줄에 앉으세요”라고 한다면? 너희는 하나님의 자녀들을 차별하고, 믿을 수 없는 재판관임을 증명한 거야.</w:t>
+              <w:t>내 사랑하는 친구들아, 우리의 영광스럽고 예수님에게서 시작된 믿음을 세상의 눈치에 따라 살지 마. 이런 상황을 상상해봐. 어떤 사람이 비싼 정장을 입고 너희 교회에 들어오고, 바로 뒤에 누더기를 입은 노숙자가 들어와. 정장 입은 사람한테는 “여기 앉으세요, 선생님 — 최고의 자리입니다!”라고 하면서, 노숙자는 무시하거나 “뒷줄에 앉으세요”라고 한다면? 너희는 하나님의 자녀들을 차별하고, 믿을 수 없는 재판관임을 증명한 거 아니야?</w:t>
             </w:r>
           </w:p>
         </w:tc>
@@ -1255,7 +1255,7 @@
               <w:rPr>
                 <w:sz w:val="18"/>
               </w:rPr>
-              <w:t>잘 들어봐, 사랑하는 친구들아. 하나님은 완전히 다른 방식으로 일하신다는 거, 이제는 뻔하지 않아? 하나님은 세상의 가난한 사람들을 뽑아서 그 나라의 첫 시민으로 삼으셨어 — 완전한 권리와 특권을 가진. 이 나라는 하나님을 사랑하는 누구에게나 약속된 나라야. 그런데 너희는 바로 그 시민들을 무시하고 있어! 너희를 착취하는 건 잘난 척하는 권력자들이 아니야? 법정을 이용해 너희를 털어가는 것도 걔네들이잖아. 세례 받을 때 받은 새 이름 — “그리스도인” — 을 비웃는 것도 바로 걔네들이라고.</w:t>
+              <w:t>잘 들어봐, 사랑하는 친구들아. 하나님은 완전히 다른 방식으로 일하신다는 거, 이제는 뻔하지 않아? 하나님은 세상의 가난한 사람들을 뽑아서 그 나라의 첫 시민으로 삼으셨어 — 완전한 권리와 특권을 가진. 이 나라는 하나님을 사랑하는 누구에게나 약속된 나라야. 그런데 너희는 바로 그 시민들을 괴롭히고 있어! 너희를 착취하는 건 잘난 척하는 권력자들이 아니야? 법정을 이용해 너희를 털어가는 것도 걔네들이잖아. 세례 받을 때 받은 새 이름 — “그리스도인” — 을 비웃는 것도 바로 걔네들이라고.</w:t>
             </w:r>
           </w:p>
         </w:tc>
@@ -2505,7 +2505,7 @@
               <w:rPr>
                 <w:sz w:val="18"/>
               </w:rPr>
-              <w:t>진짜 지혜 — 하나님의 지혜 — 는 거룩한 삶에서 시작돼. 그리고 다른 사람들과 잘 지내는 걸로 알아볼 수 있어. 부드럽고, 이성적이고, 자비와 축복이 넘쳐. 하루는 뜨거웠다가 다음 날 차가워지는 변덕도 없고, 겉과 속이 다르지도 않아. 서로 잘 지내려고 애쓰고 서로를 존엄과 예의로 대하는 수고를 한다면, 하나님과 바르게 사는 건강하고 튼튼한 공동체를 만들고 그 열매도 누릴 수 있어.</w:t>
+              <w:t>진짜 지혜 — 하나님의 지혜 — 는 거룩한 삶에서 시작돼. 그리고 다른 사람들과 잘 지내는 걸로 알아볼 수 있어. 부드럽고, 이성적이고, 자비와 축복이 넘쳐. 하루는 뜨거웠다가 다음 날 차가워지는 변덕도 없고, 겉과 속이 다르지도 않아. 서로 잘 지내려고 애쓰고 서로를 존엄과 예의로 대하는 수고를 할 때*만*, 하나님과 바르게 사는 건강하고 튼튼한 공동체를 만들고 그 열매도 누릴 수 있어.</w:t>
             </w:r>
           </w:p>
         </w:tc>
@@ -3195,7 +3195,7 @@
               <w:rPr>
                 <w:sz w:val="18"/>
               </w:rPr>
-              <w:t>지금 너희는 자기 과시에 흠뻑 빠져 있어. 그런 자랑질하는 자기중심은 다 악한 거야. 그리고 결정타는 이거야. 옳은 일을 알면서도 안 하면 — 그게 너희에게는 *바로 죄*야.</w:t>
+              <w:t>지금 너희는 자기 과시에 흠뻑 빠져 있어. 그런 자랑질하는 자기중심은 다 악한 거야. 사실은, 옳은 일을 알면서도 안 하면 — 그게 너희에게는 *바로 악한 거*야.</w:t>
             </w:r>
           </w:p>
         </w:tc>

</xml_diff>